<commit_message>
Align editable paper with A4 layout and visible page numbering
</commit_message>
<xml_diff>
--- a/docs/paper/reference.docx
+++ b/docs/paper/reference.docx
@@ -314,9 +314,13 @@
       </w:r>
     </w:p>
     <w:sectPr>
+      <w:footerReference w:type="default" r:id="rId9"/>
       <w:footnotePr>
         <w:numRestart w:val="eachSect"/>
       </w:footnotePr>
+      <w:pgSz w:w="11906" w:h="16838"/>
+      <w:pgMar w:top="1417" w:bottom="1417" w:left="1417" w:right="1417" w:footer="680"/>
+      <w:titlePg/>
     </w:sectPr>
   </w:body>
 </w:document>
@@ -324,6 +328,47 @@
 
 <file path=word/comments.xml><?xml version="1.0" encoding="utf-8"?>
 <w:comments xmlns:w="http://schemas.openxmlformats.org/wordprocessingml/2006/main" xmlns:m="http://schemas.openxmlformats.org/officeDocument/2006/math" xmlns:r="http://schemas.openxmlformats.org/officeDocument/2006/relationships" xmlns:o="urn:schemas-microsoft-com:office:office" xmlns:v="urn:schemas-microsoft-com:vml" xmlns:w10="urn:schemas-microsoft-com:office:word" xmlns:a="http://schemas.openxmlformats.org/drawingml/2006/main" xmlns:pic="http://schemas.openxmlformats.org/drawingml/2006/picture" xmlns:wp="http://schemas.openxmlformats.org/drawingml/2006/wordprocessingDrawing"/>
+</file>
+
+<file path=word/footer1.xml><?xml version="1.0" encoding="utf-8"?>
+<w:ftr xmlns:m="http://schemas.openxmlformats.org/officeDocument/2006/math" xmlns:mc="http://schemas.openxmlformats.org/markup-compatibility/2006" xmlns:mo="http://schemas.microsoft.com/office/mac/office/2008/main" xmlns:mv="urn:schemas-microsoft-com:mac:vml" xmlns:o="urn:schemas-microsoft-com:office:office" xmlns:r="http://schemas.openxmlformats.org/officeDocument/2006/relationships" xmlns:v="urn:schemas-microsoft-com:vml" xmlns:w10="urn:schemas-microsoft-com:office:word" xmlns:w14="http://schemas.microsoft.com/office/word/2010/wordml" xmlns:w="http://schemas.openxmlformats.org/wordprocessingml/2006/main" xmlns:wne="http://schemas.microsoft.com/office/word/2006/wordml" xmlns:wp14="http://schemas.microsoft.com/office/word/2010/wordprocessingDrawing" xmlns:wp="http://schemas.openxmlformats.org/drawingml/2006/wordprocessingDrawing" xmlns:wpc="http://schemas.microsoft.com/office/word/2010/wordprocessingCanvas" xmlns:wpg="http://schemas.microsoft.com/office/word/2010/wordprocessingGroup" xmlns:wpi="http://schemas.microsoft.com/office/word/2010/wordprocessingInk" xmlns:wps="http://schemas.microsoft.com/office/word/2010/wordprocessingShape" mc:Ignorable="w14 wp14">
+  <w:p>
+    <w:pPr>
+      <w:pStyle w:val="Footer"/>
+      <w:jc w:val="center"/>
+    </w:pPr>
+    <w:r>
+      <w:rPr>
+        <w:sz w:val="18"/>
+      </w:rPr>
+      <w:fldChar w:fldCharType="begin"/>
+    </w:r>
+    <w:r>
+      <w:rPr>
+        <w:sz w:val="18"/>
+      </w:rPr>
+      <w:instrText> PAGE </w:instrText>
+    </w:r>
+    <w:r>
+      <w:rPr>
+        <w:sz w:val="18"/>
+      </w:rPr>
+      <w:fldChar w:fldCharType="separate"/>
+    </w:r>
+    <w:r>
+      <w:rPr>
+        <w:sz w:val="18"/>
+      </w:rPr>
+      <w:t>1</w:t>
+    </w:r>
+    <w:r>
+      <w:rPr>
+        <w:sz w:val="18"/>
+      </w:rPr>
+      <w:fldChar w:fldCharType="end"/>
+    </w:r>
+  </w:p>
+</w:ftr>
 </file>
 
 <file path=word/footnotes.xml><?xml version="1.0" encoding="utf-8"?>
@@ -540,6 +585,7 @@
     </w:pPr>
     <w:rPr>
       <w:rFonts w:asciiTheme="majorHAnsi" w:eastAsiaTheme="majorEastAsia" w:hAnsiTheme="majorHAnsi" w:cstheme="majorBidi"/>
+      <w:color w:val="000000"/>
       <w:sz w:val="56"/>
       <w:szCs w:val="56"/>
     </w:rPr>
@@ -572,6 +618,7 @@
     </w:pPr>
     <w:rPr>
       <w:rFonts w:eastAsiaTheme="majorEastAsia" w:cstheme="majorBidi"/>
+      <w:color w:val="000000"/>
       <w:spacing w:val="15"/>
       <w:sz w:val="28"/>
       <w:szCs w:val="28"/>
@@ -677,7 +724,7 @@
     </w:pPr>
     <w:rPr>
       <w:rFonts w:asciiTheme="majorHAnsi" w:eastAsiaTheme="majorEastAsia" w:hAnsiTheme="majorHAnsi" w:cstheme="majorBidi"/>
-      <w:color w:val="0F4761" w:themeColor="accent1" w:themeShade="BF"/>
+      <w:color w:val="000000"/>
       <w:sz w:val="40"/>
       <w:szCs w:val="40"/>
     </w:rPr>
@@ -700,7 +747,7 @@
     </w:pPr>
     <w:rPr>
       <w:rFonts w:asciiTheme="majorHAnsi" w:eastAsiaTheme="majorEastAsia" w:hAnsiTheme="majorHAnsi" w:cstheme="majorBidi"/>
-      <w:color w:val="0F4761" w:themeColor="accent1" w:themeShade="BF"/>
+      <w:color w:val="000000"/>
       <w:sz w:val="32"/>
       <w:szCs w:val="32"/>
     </w:rPr>
@@ -723,7 +770,7 @@
     </w:pPr>
     <w:rPr>
       <w:rFonts w:eastAsiaTheme="majorEastAsia" w:cstheme="majorBidi"/>
-      <w:color w:val="0F4761" w:themeColor="accent1" w:themeShade="BF"/>
+      <w:color w:val="000000"/>
       <w:sz w:val="28"/>
       <w:szCs w:val="28"/>
     </w:rPr>
@@ -1136,7 +1183,7 @@
       <w:rFonts w:asciiTheme="majorHAnsi" w:eastAsiaTheme="majorEastAsia" w:hAnsiTheme="majorHAnsi" w:cstheme="majorBidi"/>
       <w:b w:val="0"/>
       <w:bCs w:val="0"/>
-      <w:color w:val="365F91" w:themeColor="accent1" w:themeShade="BF"/>
+      <w:color w:val="000000"/>
     </w:rPr>
   </w:style>
   <w:style w:type="paragraph" w:customStyle="1" w:styleId="TOC1">

</xml_diff>